<commit_message>
docs: align proposal with JC2001 lectures and sync exports
</commit_message>
<xml_diff>
--- a/docs/downloads/Campus_Neighbour_Proposal.docx
+++ b/docs/downloads/Campus_Neighbour_Proposal.docx
@@ -495,7 +495,7 @@
     </w:p>
     <w:p>
       <w:r>
-        <w:t>We propose a responsive web application for campus second-hand trading. A seller publishes an item, a buyer browses or searches, both parties communicate through private chat, they agree an in-person handover, the buyer confirms receipt on a phone, and both parties can leave feedback. The platform will support student and administrator accounts, listing moderation and notifications.</w:t>
+        <w:t>We propose a responsive web application with desktop and mobile layouts for campus second-hand trading. A seller publishes an item, a buyer browses or searches, both parties communicate through private chat, they agree an in-person handover, the buyer confirms receipt on a phone, and both parties can leave feedback. The platform will support student and administrator accounts, listing moderation and notifications.</w:t>
       </w:r>
     </w:p>
     <w:p>
@@ -527,6 +527,19 @@
       </w:r>
     </w:p>
     <w:p>
+      <w:commentRangeStart w:id="0"/>
+      <w:r>
+        <w:t>We will use incremental development with short agile iterations, combining requirements, design, implementation and validation in each cycle [3]. Demonstrations and student feedback will guide the next priorities. Iterations will improve usability and reliability as well as introduce agreed trading enhancements. Versioned documentation and regular refactoring will keep the design understandable as it evolves.</w:t>
+      </w:r>
+      <w:commentRangeEnd w:id="0"/>
+      <w:r>
+        <w:rPr>
+          <w:rStyle w:val="CommentReference"/>
+        </w:rPr>
+        <w:commentReference w:id="0"/>
+      </w:r>
+    </w:p>
+    <w:p>
       <w:pPr>
         <w:pStyle w:val="Heading2"/>
       </w:pPr>
@@ -542,6 +555,19 @@
     <w:p>
       <w:r>
         <w:t>The proposed system consists of a browser interface, an application server and a relational database. Main records include users, buildings, courses, listings, conversations, transactions, barter preferences and reviews. Access controls will protect private messages and transaction actions. Item reservation and receipt confirmation will be recorded as controlled state changes to prevent conflicting transactions.</w:t>
+      </w:r>
+    </w:p>
+    <w:p>
+      <w:commentRangeStart w:id="1"/>
+      <w:r>
+        <w:t>Quality requirements will address security, reliability, usability and maintainability [2, 5]. These include participant-only chat access, consistent reservation states, usable desktop and mobile layouts, Chinese and English interfaces, and light and dark themes. Setup instructions, a user guide and a defect log will support use and maintenance.</w:t>
+      </w:r>
+      <w:commentRangeEnd w:id="1"/>
+      <w:r>
+        <w:rPr>
+          <w:rStyle w:val="CommentReference"/>
+        </w:rPr>
+        <w:commentReference w:id="1"/>
       </w:r>
     </w:p>
     <w:p>
@@ -578,8 +604,16 @@
       <w:r/>
     </w:p>
     <w:p>
+      <w:commentRangeStart w:id="2"/>
       <w:r>
-        <w:t>Define the campus trading requirements, use cases, interface prototype, architecture, data model and acceptance tests.</w:t>
+        <w:t>Validate the initial problem assumptions through short interviews with student buyers and sellers and walkthroughs of existing trading practices. Review moderation needs with a representative of the administrator role. Record plain-language user stories and detailed system requirements separately, distinguishing functions from quality constraints [5]. Review the prototype and requirements for validity, consistency, completeness, feasibility and testability; link agreed requirements to use cases, design and acceptance tests.</w:t>
+      </w:r>
+      <w:commentRangeEnd w:id="2"/>
+      <w:r>
+        <w:rPr>
+          <w:rStyle w:val="CommentReference"/>
+        </w:rPr>
+        <w:commentReference w:id="2"/>
       </w:r>
     </w:p>
     <w:p>
@@ -630,7 +664,7 @@
     </w:p>
     <w:p>
       <w:r>
-        <w:t>Test the main workflows, permissions and transaction states, resolve critical defects, and deliver reproducible software and course documentation.</w:t>
+        <w:t>Apply test-driven development (TDD) to new business rules and bug fixes, test the integrated workflows, resolve critical defects, and deliver reproducible software and course documentation [3].</w:t>
       </w:r>
     </w:p>
     <w:p>
@@ -643,7 +677,12 @@
     </w:p>
     <w:p>
       <w:r>
-        <w:t>Evaluation will use agreed acceptance tests and student task sessions to check the trading flow, listing filters and transaction states. Chat tests will cover the three question buttons, the 20-character free-message limit, replies from the other participant, access control, message history and failed-send recovery. Final targets will be confirmed after requirements and sample data are available.</w:t>
+        <w:t>For TDD, write a failing test for an agreed behaviour, implement enough code to pass it, then refactor while keeping tests passing. For example, test that two buyers cannot hold an active reservation for the same item. Automated unit and integration checks will run through continuous integration; end-to-end tests will cover complete trading scenarios.</w:t>
+      </w:r>
+    </w:p>
+    <w:p>
+      <w:r>
+        <w:t>Acceptance tests will check conformance to requirements; student task sessions will check whether the platform meets users' needs [3, 5]. Checks will include filters, transaction states, chat shortcuts, the 20-character message limit, message recovery, permissions and both screen layouts. Usability and performance targets will be agreed after initial requirements and sample data are available, with test conditions recorded. Defects and feedback will inform the next iteration.</w:t>
       </w:r>
     </w:p>
     <w:p>
@@ -1492,6 +1531,19 @@
       </w:r>
     </w:p>
     <w:p>
+      <w:commentRangeStart w:id="3"/>
+      <w:r>
+        <w:t>The group will track prioritised tasks, estimates, dependencies and completion evidence in GitHub Issues [4]. Weekly reviews will compare working software and test results with the plan, discuss blockers and record decisions for course updates. Integration delays and scope changes will be monitored through early integration and a prioritised backlog. Proposed changes will be assessed for user value, effort and effects on design and tests before updating the requirements and plan [5].</w:t>
+      </w:r>
+      <w:commentRangeEnd w:id="3"/>
+      <w:r>
+        <w:rPr>
+          <w:rStyle w:val="CommentReference"/>
+        </w:rPr>
+        <w:commentReference w:id="3"/>
+      </w:r>
+    </w:p>
+    <w:p>
       <w:pPr>
         <w:pStyle w:val="Heading2"/>
       </w:pPr>
@@ -1638,7 +1690,7 @@
                 <w:b w:val="0"/>
                 <w:sz w:val="24"/>
               </w:rPr>
-              <w:t>Collect user needs and agree the project scope.</w:t>
+              <w:t>Interview users, review trading practices and prioritise requirements.</w:t>
             </w:r>
           </w:p>
         </w:tc>
@@ -1725,7 +1777,7 @@
                 <w:b w:val="0"/>
                 <w:sz w:val="24"/>
               </w:rPr>
-              <w:t>Prepare use cases, prototype, architecture and data model.</w:t>
+              <w:t>Review use cases, prototype, architecture, data model and acceptance criteria.</w:t>
             </w:r>
           </w:p>
         </w:tc>
@@ -2574,7 +2626,7 @@
                 <w:b w:val="0"/>
                 <w:sz w:val="24"/>
               </w:rPr>
-              <w:t>Test permissions, trading states, search and concurrency.</w:t>
+              <w:t>Use TDD and automated checks for permissions, trading states, search and concurrency.</w:t>
             </w:r>
           </w:p>
         </w:tc>
@@ -2854,6 +2906,26 @@
         <w:t>Source accessed 15 September 2026. The English title is a descriptive translation of the Chinese original.</w:t>
       </w:r>
     </w:p>
+    <w:p>
+      <w:r>
+        <w:t>[2] JC2001 (2026–27). Lecture 1: Introduction &amp; Course Overview. Course slides, Week 1, Day 1.</w:t>
+      </w:r>
+    </w:p>
+    <w:p>
+      <w:r>
+        <w:t>[3] JC2001 (2026–27). Lecture 2: Software Processes &amp; Agile Software Development. Course slides, Week 2, Day 1.</w:t>
+      </w:r>
+    </w:p>
+    <w:p>
+      <w:r>
+        <w:t>[4] JC2001 (2026–27). Lecture 3: Project Management. Course slides, Week 2, Day 2.</w:t>
+      </w:r>
+    </w:p>
+    <w:p>
+      <w:r>
+        <w:t>[5] JC2001 (2026–27). Lecture 5: Requirements Engineering. Course slides, Week 4, Day 1.</w:t>
+      </w:r>
+    </w:p>
     <w:sectPr>
       <w:footerReference w:type="default" r:id="rId9"/>
       <w:pgSz w:w="11906" w:h="16838"/>
@@ -2864,6 +2936,75 @@
     </w:sectPr>
   </w:body>
 </w:document>
+</file>
+
+<file path=word/comments.xml><?xml version="1.0" encoding="utf-8"?>
+<w:comments xmlns:a="http://schemas.openxmlformats.org/drawingml/2006/main" xmlns:pic="http://schemas.openxmlformats.org/drawingml/2006/picture" xmlns:r="http://schemas.openxmlformats.org/officeDocument/2006/relationships" xmlns:w="http://schemas.openxmlformats.org/wordprocessingml/2006/main" xmlns:wp="http://schemas.openxmlformats.org/drawingml/2006/wordprocessingDrawing" xmlns:mc="http://schemas.openxmlformats.org/markup-compatibility/2006" xmlns:a14="http://schemas.microsoft.com/office/drawing/2010/main" xmlns:w14="http://schemas.microsoft.com/office/word/2010/wordml" xmlns:wpc="http://schemas.microsoft.com/office/word/2010/wordprocessingCanvas">
+  <w:comment w:id="0" w:author="Review" w:initials="R" w:date="2026-09-23T06:29:04Z">
+    <w:p>
+      <w:pPr>
+        <w:pStyle w:val="CommentText"/>
+      </w:pPr>
+      <w:r>
+        <w:rPr>
+          <w:rStyle w:val="CommentReference"/>
+        </w:rPr>
+        <w:annotationRef/>
+      </w:r>
+      <w:r>
+        <w:t>Lecture 2: incremental development and XP practices. Iterations include refinement and feedback, as well as agreed enhancements.</w:t>
+      </w:r>
+    </w:p>
+  </w:comment>
+  <w:comment w:id="1" w:author="Review" w:initials="R" w:date="2026-09-23T06:29:04Z">
+    <w:p>
+      <w:pPr>
+        <w:pStyle w:val="CommentText"/>
+      </w:pPr>
+      <w:r>
+        <w:rPr>
+          <w:rStyle w:val="CommentReference"/>
+        </w:rPr>
+        <w:annotationRef/>
+      </w:r>
+      <w:r>
+        <w:t>Lectures 1 and 5: quality requirements and supporting documentation complement the functional scope.</w:t>
+      </w:r>
+    </w:p>
+  </w:comment>
+  <w:comment w:id="2" w:author="Review" w:initials="R" w:date="2026-09-23T06:29:04Z">
+    <w:p>
+      <w:pPr>
+        <w:pStyle w:val="CommentText"/>
+      </w:pPr>
+      <w:r>
+        <w:rPr>
+          <w:rStyle w:val="CommentReference"/>
+        </w:rPr>
+        <w:annotationRef/>
+      </w:r>
+      <w:r>
+        <w:t>Lecture 5: elicitation, specification and validation. These activities are proposed; this paragraph does not claim that interviews have already occurred.</w:t>
+      </w:r>
+    </w:p>
+  </w:comment>
+  <w:comment w:id="3" w:author="Review" w:initials="R" w:date="2026-09-23T06:29:04Z">
+    <w:p>
+      <w:pPr>
+        <w:pStyle w:val="CommentText"/>
+      </w:pPr>
+      <w:r>
+        <w:rPr>
+          <w:rStyle w:val="CommentReference"/>
+        </w:rPr>
+        <w:annotationRef/>
+      </w:r>
+      <w:r>
+        <w:t>Lectures 3 and 5: progress evidence, communication and change management. GitHub Issues and weekly reviews are project choices.</w:t>
+      </w:r>
+    </w:p>
+  </w:comment>
+</w:comments>
 </file>
 
 <file path=word/footer1.xml><?xml version="1.0" encoding="utf-8"?>

</xml_diff>

<commit_message>
docs: assign nine team roles across proposal and project documents
</commit_message>
<xml_diff>
--- a/docs/downloads/Campus_Neighbour_Proposal.docx
+++ b/docs/downloads/Campus_Neighbour_Proposal.docx
@@ -394,7 +394,7 @@
               <w:br/>
               <w:t>4. RUIYU GONG 50106169</w:t>
               <w:br/>
-              <w:t>5. Han Huang 50106171</w:t>
+              <w:t>5. HAN HUANG 50106171</w:t>
               <w:br/>
               <w:t>6. YIAYI WU 50106143</w:t>
               <w:br/>
@@ -1527,7 +1527,20 @@
     </w:p>
     <w:p>
       <w:r>
-        <w:t>Internal task assignments, deadlines and progress values are to be filled by the group in line with the course dates above.</w:t>
+        <w:t>Responsibilities are assigned below. Internal deadlines and progress remain to be filled in line with the course dates above; assignment does not imply completion.</w:t>
+      </w:r>
+    </w:p>
+    <w:p>
+      <w:commentRangeStart w:id="4"/>
+      <w:r>
+        <w:t>YUHAN JIAO leads architecture, core development and integration; RUIYU GONG develops supporting features; YIAYI WU manages requirements; JIAYI ZHENG leads interaction design; HAN HUANG leads functional testing; ZIYE JIANG leads test automation and quality; RUIJIE LI manages deployment and software delivery; JUNYU PAN coordinates technical documentation; LU LIU coordinates the project and presentation. Members provide evidence for their own work and review one another's outputs.</w:t>
+      </w:r>
+      <w:commentRangeEnd w:id="4"/>
+      <w:r>
+        <w:rPr>
+          <w:rStyle w:val="CommentReference"/>
+        </w:rPr>
+        <w:commentReference w:id="4"/>
       </w:r>
     </w:p>
     <w:p>
@@ -1710,7 +1723,7 @@
                 <w:b w:val="0"/>
                 <w:sz w:val="24"/>
               </w:rPr>
-              <w:t>[To be filled]</w:t>
+              <w:t>YIAYI WU</w:t>
             </w:r>
           </w:p>
         </w:tc>
@@ -1797,7 +1810,9 @@
                 <w:b w:val="0"/>
                 <w:sz w:val="24"/>
               </w:rPr>
-              <w:t>[To be filled]</w:t>
+              <w:t>JIAYI ZHENG</w:t>
+              <w:br/>
+              <w:t>YUHAN JIAO</w:t>
             </w:r>
           </w:p>
         </w:tc>
@@ -2022,7 +2037,9 @@
                 <w:b w:val="0"/>
                 <w:sz w:val="24"/>
               </w:rPr>
-              <w:t>[To be filled]</w:t>
+              <w:t>YUHAN JIAO</w:t>
+              <w:br/>
+              <w:t>RUIYU GONG</w:t>
             </w:r>
           </w:p>
         </w:tc>
@@ -2109,7 +2126,7 @@
                 <w:b w:val="0"/>
                 <w:sz w:val="24"/>
               </w:rPr>
-              <w:t>[To be filled]</w:t>
+              <w:t>YUHAN JIAO</w:t>
             </w:r>
           </w:p>
         </w:tc>
@@ -2334,7 +2351,9 @@
                 <w:b w:val="0"/>
                 <w:sz w:val="24"/>
               </w:rPr>
-              <w:t>[To be filled]</w:t>
+              <w:t>RUIYU GONG</w:t>
+              <w:br/>
+              <w:t>YUHAN JIAO</w:t>
             </w:r>
           </w:p>
         </w:tc>
@@ -2421,7 +2440,9 @@
                 <w:b w:val="0"/>
                 <w:sz w:val="24"/>
               </w:rPr>
-              <w:t>[To be filled]</w:t>
+              <w:t>RUIYU GONG</w:t>
+              <w:br/>
+              <w:t>ZIYE JIANG</w:t>
             </w:r>
           </w:p>
         </w:tc>
@@ -2626,7 +2647,7 @@
                 <w:b w:val="0"/>
                 <w:sz w:val="24"/>
               </w:rPr>
-              <w:t>Use TDD and automated checks for permissions, trading states, search and concurrency.</w:t>
+              <w:t>Coordinate automated quality checks; developers apply TDD to their changes.</w:t>
             </w:r>
           </w:p>
         </w:tc>
@@ -2646,7 +2667,7 @@
                 <w:b w:val="0"/>
                 <w:sz w:val="24"/>
               </w:rPr>
-              <w:t>[To be filled]</w:t>
+              <w:t>ZIYE JIANG</w:t>
             </w:r>
           </w:p>
         </w:tc>
@@ -2713,7 +2734,7 @@
                 <w:b w:val="0"/>
                 <w:sz w:val="24"/>
               </w:rPr>
-              <w:t>Run student tasks, resolve defects and repeat affected tests.</w:t>
+              <w:t>Run student tasks and retest defects after developers fix them.</w:t>
             </w:r>
           </w:p>
         </w:tc>
@@ -2733,7 +2754,7 @@
                 <w:b w:val="0"/>
                 <w:sz w:val="24"/>
               </w:rPr>
-              <w:t>[To be filled]</w:t>
+              <w:t>HAN HUANG</w:t>
             </w:r>
           </w:p>
         </w:tc>
@@ -2800,7 +2821,7 @@
                 <w:b w:val="0"/>
                 <w:sz w:val="24"/>
               </w:rPr>
-              <w:t>Prepare the release, report, manual and presentation.</w:t>
+              <w:t>Prepare the release (LI), report and manual (PAN), and coordination and presentation (LIU).</w:t>
             </w:r>
           </w:p>
         </w:tc>
@@ -2820,7 +2841,11 @@
                 <w:b w:val="0"/>
                 <w:sz w:val="24"/>
               </w:rPr>
-              <w:t>[To be filled]</w:t>
+              <w:t>RUIJIE LI</w:t>
+              <w:br/>
+              <w:t>JUNYU PAN</w:t>
+              <w:br/>
+              <w:t>LU LIU</w:t>
             </w:r>
           </w:p>
         </w:tc>
@@ -2881,6 +2906,7 @@
     <w:p>
       <w:pPr>
         <w:pStyle w:val="Heading1"/>
+        <w:pageBreakBefore/>
       </w:pPr>
       <w:r>
         <w:t>References</w:t>
@@ -3001,6 +3027,22 @@
       </w:r>
       <w:r>
         <w:t>Lectures 3 and 5: progress evidence, communication and change management. GitHub Issues and weekly reviews are project choices.</w:t>
+      </w:r>
+    </w:p>
+  </w:comment>
+  <w:comment w:id="4" w:author="Review" w:initials="R" w:date="2026-09-23T11:41:44Z">
+    <w:p>
+      <w:pPr>
+        <w:pStyle w:val="CommentText"/>
+      </w:pPr>
+      <w:r>
+        <w:rPr>
+          <w:rStyle w:val="CommentReference"/>
+        </w:rPr>
+        <w:annotationRef/>
+      </w:r>
+      <w:r>
+        <w:t>Role assignments follow the supplied R1–R9 roster. Internal dates, progress and individual task reviewers remain unfilled.</w:t>
       </w:r>
     </w:p>
   </w:comment>

</xml_diff>